<commit_message>
docs: mark user-blocking as shipped in the store-submission checklist
Was still showing as an open gap after PR #16 shipped and was verified
in production.

Co-Authored-By: Claude Sonnet 5 <noreply@anthropic.com>
</commit_message>
<xml_diff>
--- a/docs/store-submission.docx
+++ b/docs/store-submission.docx
@@ -1687,10 +1687,10 @@
         <w:rPr>
           <w:b/>
         </w:rPr>
-        <w:t xml:space="preserve">⬜ User-blocking isn't implemented (Apple Guideline 1.2 — UGC apps). </w:t>
+        <w:t xml:space="preserve">✅ Fixed. User-blocking shipped. </w:t>
       </w:r>
       <w:r>
-        <w:t>The app has messaging, game listings, and public profiles — Apple requires apps with user-generated content or user-to-user communication to let users block abusive users, not just report them. Reporting exists and works (fileReport in squads/actions.ts feeds an admin moderation queue at /platform/reports), but “blocked users” is explicitly listed as coming soon in profile/coming-soon/page.tsx. This needs to ship before submitting an app with the messaging feature turned on, or the feature needs to be gated off for v1.</w:t>
+        <w:t>User-blocking (Apple Guideline 1.2 — UGC apps) is shipped and verified in production (PR #16). Blocking someone ends the friendship, cancels pending friend requests, stops new friend requests and new DM sends (in either direction, even in an existing conversation — closed a real pre-existing gap where DM send RLS only checked participancy, not live friendship), and never reveals to the blocked party that they've been blocked. RUN_ME_user_blocking.sql ran clean against production (table, functions, and policies all confirmed present). Reporting (fileReport in squads/actions.ts) still feeds the admin moderation queue at /platform/reports alongside it. Profile → Privacy now lists and manages blocked users for real instead of the old “coming soon” stub.</w:t>
       </w:r>
     </w:p>
     <w:p>
@@ -1851,7 +1851,7 @@
         <w:pStyle w:val="ListBullet"/>
       </w:pPr>
       <w:r>
-        <w:t>☐  Ship (or feature-gate) user-blocking before submitting with messaging enabled</w:t>
+        <w:t>✓ Ship user-blocking (done)</w:t>
       </w:r>
     </w:p>
     <w:p>

</xml_diff>

<commit_message>
Seed a reviewer/demo account; write up the screenshot shot list
scripts/seed-demo-account.mjs creates (or resets) appreview@sportonica.com
via the Supabase admin API, with role: "player" already set so it skips
/welcome onboarding — verified end to end with a real sign-in. Idempotent,
prints fresh credentials to the terminal only, never writes them to a file.

Also wrote up the exact screenshot shot list (devices, DevTools method,
which screens, why those specific public pages avoid the empty-new-account
problem) since Claude in Chrome wasn't connected this session to capture
them directly.

Co-Authored-By: Claude Sonnet 5 <noreply@anthropic.com>
</commit_message>
<xml_diff>
--- a/docs/store-submission.docx
+++ b/docs/store-submission.docx
@@ -1549,6 +1549,309 @@
     <w:p/>
     <w:p>
       <w:pPr>
+        <w:pStyle w:val="Heading2"/>
+      </w:pPr>
+      <w:r>
+        <w:t>Screenshot shot list</w:t>
+      </w:r>
+    </w:p>
+    <w:p>
+      <w:r>
+        <w:rPr>
+          <w:b w:val="0"/>
+          <w:i w:val="0"/>
+        </w:rPr>
+        <w:t>No device emulation tooling was available in this session (Claude in Chrome's browser control wasn't connected), so these weren't captured here — this is the exact list and method to do it by hand. The app is a Capacitor shell with no native chrome (capacitor.config.ts — full-screen WKWebView loading the live site), so a correctly device-emulated browser screenshot of https://www.sportonica.com is visually identical to what the native app shows. Chrome DevTools' device toolbar does this properly (real device pixel ratio + viewport), which a plain browser window resize can't.</w:t>
+      </w:r>
+    </w:p>
+    <w:p>
+      <w:r>
+        <w:rPr>
+          <w:b/>
+          <w:i w:val="0"/>
+        </w:rPr>
+        <w:t>Method (repeat per device below):</w:t>
+      </w:r>
+    </w:p>
+    <w:p>
+      <w:pPr>
+        <w:pStyle w:val="ListBullet"/>
+      </w:pPr>
+      <w:r>
+        <w:t>Open https://www.sportonica.com in Chrome</w:t>
+      </w:r>
+    </w:p>
+    <w:p>
+      <w:pPr>
+        <w:pStyle w:val="ListBullet"/>
+      </w:pPr>
+      <w:r>
+        <w:t>DevTools → Toggle device toolbar (Cmd+Shift+M / Ctrl+Shift+M)</w:t>
+      </w:r>
+    </w:p>
+    <w:p>
+      <w:pPr>
+        <w:pStyle w:val="ListBullet"/>
+      </w:pPr>
+      <w:r>
+        <w:t>Pick the device preset (or a Custom one matching the dimensions below), zoom 100%</w:t>
+      </w:r>
+    </w:p>
+    <w:p>
+      <w:pPr>
+        <w:pStyle w:val="ListBullet"/>
+      </w:pPr>
+      <w:r>
+        <w:t>Cmd+Shift+P / Ctrl+Shift+P → “Capture screenshot” — exports at the emulated device's real pixel dimensions, not the CSS window size, so it comes out submission-ready with no manual resizing</w:t>
+      </w:r>
+    </w:p>
+    <w:p>
+      <w:pPr>
+        <w:pStyle w:val="ListBullet"/>
+      </w:pPr>
+      <w:r>
+        <w:t>Repeat for each screen in the shot list, save as store-assets/ios/&lt;n&gt;-&lt;name&gt;.png / store-assets/android/&lt;n&gt;-&lt;name&gt;.png</w:t>
+      </w:r>
+    </w:p>
+    <w:tbl>
+      <w:tblPr>
+        <w:tblStyle w:val="LightGrid-Accent1"/>
+        <w:tblW w:type="auto" w:w="0"/>
+        <w:tblLook w:firstColumn="1" w:firstRow="1" w:lastColumn="0" w:lastRow="0" w:noHBand="0" w:noVBand="1" w:val="04A0"/>
+      </w:tblPr>
+      <w:tblGrid>
+        <w:gridCol w:w="2880"/>
+        <w:gridCol w:w="2880"/>
+        <w:gridCol w:w="2880"/>
+      </w:tblGrid>
+      <w:tr>
+        <w:tc>
+          <w:tcPr>
+            <w:tcW w:type="dxa" w:w="2880"/>
+          </w:tcPr>
+          <w:p>
+            <w:r/>
+            <w:r>
+              <w:rPr>
+                <w:b/>
+                <w:sz w:val="19"/>
+              </w:rPr>
+              <w:t>Store</w:t>
+            </w:r>
+          </w:p>
+        </w:tc>
+        <w:tc>
+          <w:tcPr>
+            <w:tcW w:type="dxa" w:w="2880"/>
+          </w:tcPr>
+          <w:p>
+            <w:r/>
+            <w:r>
+              <w:rPr>
+                <w:b/>
+                <w:sz w:val="19"/>
+              </w:rPr>
+              <w:t>DevTools preset (or Custom)</w:t>
+            </w:r>
+          </w:p>
+        </w:tc>
+        <w:tc>
+          <w:tcPr>
+            <w:tcW w:type="dxa" w:w="2880"/>
+          </w:tcPr>
+          <w:p>
+            <w:r/>
+            <w:r>
+              <w:rPr>
+                <w:b/>
+                <w:sz w:val="19"/>
+              </w:rPr>
+              <w:t>Output pixels</w:t>
+            </w:r>
+          </w:p>
+        </w:tc>
+      </w:tr>
+      <w:tr>
+        <w:tc>
+          <w:tcPr>
+            <w:tcW w:type="dxa" w:w="2880"/>
+          </w:tcPr>
+          <w:p>
+            <w:r/>
+            <w:r>
+              <w:rPr>
+                <w:b w:val="0"/>
+                <w:sz w:val="19"/>
+              </w:rPr>
+              <w:t>iOS</w:t>
+            </w:r>
+          </w:p>
+        </w:tc>
+        <w:tc>
+          <w:tcPr>
+            <w:tcW w:type="dxa" w:w="2880"/>
+          </w:tcPr>
+          <w:p>
+            <w:r/>
+            <w:r>
+              <w:rPr>
+                <w:b w:val="0"/>
+                <w:sz w:val="19"/>
+              </w:rPr>
+              <w:t>iPhone 15 Pro Max (or whatever the current largest iPhone preset is — verify against App Store Connect's current requirement at submission time)</w:t>
+            </w:r>
+          </w:p>
+        </w:tc>
+        <w:tc>
+          <w:tcPr>
+            <w:tcW w:type="dxa" w:w="2880"/>
+          </w:tcPr>
+          <w:p>
+            <w:r/>
+            <w:r>
+              <w:rPr>
+                <w:b w:val="0"/>
+                <w:sz w:val="19"/>
+              </w:rPr>
+              <w:t>1290×2796</w:t>
+            </w:r>
+          </w:p>
+        </w:tc>
+      </w:tr>
+      <w:tr>
+        <w:tc>
+          <w:tcPr>
+            <w:tcW w:type="dxa" w:w="2880"/>
+          </w:tcPr>
+          <w:p>
+            <w:r/>
+            <w:r>
+              <w:rPr>
+                <w:b w:val="0"/>
+                <w:sz w:val="19"/>
+              </w:rPr>
+              <w:t>Android</w:t>
+            </w:r>
+          </w:p>
+        </w:tc>
+        <w:tc>
+          <w:tcPr>
+            <w:tcW w:type="dxa" w:w="2880"/>
+          </w:tcPr>
+          <w:p>
+            <w:r/>
+            <w:r>
+              <w:rPr>
+                <w:b w:val="0"/>
+                <w:sz w:val="19"/>
+              </w:rPr>
+              <w:t>Pixel 7 Pro, or Custom at 1080×2400</w:t>
+            </w:r>
+          </w:p>
+        </w:tc>
+        <w:tc>
+          <w:tcPr>
+            <w:tcW w:type="dxa" w:w="2880"/>
+          </w:tcPr>
+          <w:p>
+            <w:r/>
+            <w:r>
+              <w:rPr>
+                <w:b w:val="0"/>
+                <w:sz w:val="19"/>
+              </w:rPr>
+              <w:t>matches preset / 1080×2400</w:t>
+            </w:r>
+          </w:p>
+        </w:tc>
+      </w:tr>
+    </w:tbl>
+    <w:p/>
+    <w:p>
+      <w:r>
+        <w:rPr>
+          <w:b/>
+          <w:i w:val="0"/>
+        </w:rPr>
+        <w:t>Screens to capture (public pages — no login needed, already have real seeded content):</w:t>
+      </w:r>
+    </w:p>
+    <w:p>
+      <w:pPr>
+        <w:pStyle w:val="ListBullet"/>
+      </w:pPr>
+      <w:r>
+        <w:t>Home (/) — hero + featured events</w:t>
+      </w:r>
+    </w:p>
+    <w:p>
+      <w:pPr>
+        <w:pStyle w:val="ListBullet"/>
+      </w:pPr>
+      <w:r>
+        <w:t>Discover (/discover) — event list + map, the core “find a game” experience</w:t>
+      </w:r>
+    </w:p>
+    <w:p>
+      <w:pPr>
+        <w:pStyle w:val="ListBullet"/>
+      </w:pPr>
+      <w:r>
+        <w:t>Tournaments (/tournaments) — tournament listing</w:t>
+      </w:r>
+    </w:p>
+    <w:p>
+      <w:pPr>
+        <w:pStyle w:val="ListBullet"/>
+      </w:pPr>
+      <w:r>
+        <w:t>Tournament detail (/tournaments/[id]) — pick one live tournament, shows the registration/fixtures tabs</w:t>
+      </w:r>
+    </w:p>
+    <w:p>
+      <w:pPr>
+        <w:pStyle w:val="ListBullet"/>
+      </w:pPr>
+      <w:r>
+        <w:t>A venue or game detail view reached from Discover — shows the booking flow entry point</w:t>
+      </w:r>
+    </w:p>
+    <w:p>
+      <w:r>
+        <w:rPr>
+          <w:b/>
+          <w:i w:val="0"/>
+        </w:rPr>
+        <w:t>Authenticated screens (optional, sign in with the reviewer account first — see item 3 above for credentials):</w:t>
+      </w:r>
+    </w:p>
+    <w:p>
+      <w:pPr>
+        <w:pStyle w:val="ListBullet"/>
+      </w:pPr>
+      <w:r>
+        <w:t>Profile (/profile) — note: the seeded appreview@sportonica.com account is brand new with no games/bookings, so this will look sparse. Either accept that (it's honestly what a new user sees) or sign in as an account with real history if you want a more populated screenshot — don't use a real person's account for a public screenshot.</w:t>
+      </w:r>
+    </w:p>
+    <w:p>
+      <w:pPr>
+        <w:pStyle w:val="ListBullet"/>
+      </w:pPr>
+      <w:r>
+        <w:t>Messages or Play Together — same caveat as above</w:t>
+      </w:r>
+    </w:p>
+    <w:p>
+      <w:r>
+        <w:rPr>
+          <w:b w:val="0"/>
+          <w:i w:val="0"/>
+        </w:rPr>
+        <w:t>Play Store additionally wants at least 2 screenshots (up to 8); App Store Connect wants at least 1 per required device size (more is better, most listings use 4-6). The 5 public screens above comfortably cover both minimums without touching the empty-account problem.</w:t>
+      </w:r>
+    </w:p>
+    <w:p>
+      <w:pPr>
         <w:pStyle w:val="Heading1"/>
       </w:pPr>
       <w:r>
@@ -1673,10 +1976,10 @@
         <w:rPr>
           <w:b/>
         </w:rPr>
-        <w:t xml:space="preserve">⬜ No reviewer/demo account documented. </w:t>
+        <w:t xml:space="preserve">✅ Fixed. Reviewer/demo account seeded. </w:t>
       </w:r>
       <w:r>
-        <w:t>Almost the entire app sits behind login (booking, messages, tournaments, profile). Both consoles ask for this explicitly: App Store Connect → App Review Information → sign-in credentials + notes for the reviewer; Play Console → App content → App access → instructions or credentials. Without a working test account handed to reviewers, both stores will bounce the submission asking for one. Needs a seeded test account (or a documented way to create one) that isn't tied to a real person.</w:t>
+        <w:t>Seeded and verified working (sign-in tested end to end, profile lands with role: "player" so it skips /welcome onboarding and drops straight into /discover). scripts/seed-demo-account.mjs — idempotent, re-run it any time to reset the password and get fresh credentials printed to the terminal (never written to a file). Account: appreview@sportonica.com. Paste the current password into App Store Connect → App Review Information and Play Console → App content → App access when you submit — the script doesn't do that part for you, and it only prints the password once per run.</w:t>
       </w:r>
     </w:p>
     <w:p>
@@ -1843,7 +2146,7 @@
         <w:pStyle w:val="ListBullet"/>
       </w:pPr>
       <w:r>
-        <w:t>☐  Seed a reviewer/demo account and document it for App Review Information / Play App access</w:t>
+        <w:t>✓ Seed a reviewer/demo account (done) — still needs pasting into App Review Information / Play App access at actual submission time</w:t>
       </w:r>
     </w:p>
     <w:p>

</xml_diff>